<commit_message>
Add 2025-26 results: part mark 65.3, IP and CFD 70, coursework marks on project pages
Module code corrected to 25WSD550 (Advanced Individual Project) per transcript.

Co-Authored-By: Claude Fable 5 <noreply@anthropic.com>
</commit_message>
<xml_diff>
--- a/assets/Raymond_Twum-Barima_CV.docx
+++ b/assets/Raymond_Twum-Barima_CV.docx
@@ -45,7 +45,7 @@
         </w:rPr>
         <w:t xml:space="preserve">London  ·  07747 712 872  ·  </w:t>
       </w:r>
-      <w:hyperlink w:history="1" r:id="rIdzakqp5wwwesprexzpbmpo">
+      <w:hyperlink w:history="1" r:id="rIdmz-63lvig50f1csufnukt">
         <w:r>
           <w:rPr>
             <w:color w:val="0563C1"/>
@@ -64,7 +64,7 @@
         </w:rPr>
         <w:t xml:space="preserve">  ·  </w:t>
       </w:r>
-      <w:hyperlink w:history="1" r:id="rId6rtx_oybwlpmhwt_-oaix">
+      <w:hyperlink w:history="1" r:id="rId0wlxavgpq4ueddmc6duas">
         <w:r>
           <w:rPr>
             <w:color w:val="0563C1"/>
@@ -83,7 +83,7 @@
         </w:rPr>
         <w:t xml:space="preserve">  ·  </w:t>
       </w:r>
-      <w:hyperlink w:history="1" r:id="rId2zwwzadeohgq4hpbytpat">
+      <w:hyperlink w:history="1" r:id="rIdu3kbak1kmrvqjrpx7dgh7">
         <w:r>
           <w:rPr>
             <w:color w:val="0563C1"/>
@@ -102,7 +102,7 @@
         </w:rPr>
         <w:t xml:space="preserve">  ·  </w:t>
       </w:r>
-      <w:hyperlink w:history="1" r:id="rIdos10msnxkxuyfyvgovcls">
+      <w:hyperlink w:history="1" r:id="rIdgxha2j82onaaymcrdirm1">
         <w:r>
           <w:rPr>
             <w:color w:val="0563C1"/>
@@ -210,16 +210,49 @@
           <w:sz w:val="20"/>
           <w:szCs w:val="20"/>
         </w:rPr>
-        <w:t xml:space="preserve">Computational Fluid Dynamics, Advanced Heat Transfer, Sustainable Engineering, Finite Element Analysis, Kinematics &amp; Dynamics.  </w:t>
-      </w:r>
-      <w:r>
-        <w:rPr>
-          <w:b/>
-          <w:bCs/>
-          <w:sz w:val="20"/>
-          <w:szCs w:val="20"/>
-        </w:rPr>
-        <w:t xml:space="preserve">Overall: 56%.</w:t>
+        <w:t xml:space="preserve">Computational Fluid Dynamics, Advanced Heat Transfer, Sustainable Engineering, Finite Element Analysis, Kinematics &amp; Dynamics.</w:t>
+      </w:r>
+    </w:p>
+    <w:p>
+      <w:pPr>
+        <w:pStyle w:val="ListParagraph"/>
+        <w:numPr>
+          <w:ilvl w:val="0"/>
+          <w:numId w:val="2"/>
+        </w:numPr>
+        <w:spacing w:after="30"/>
+      </w:pPr>
+      <w:r>
+        <w:rPr>
+          <w:b/>
+          <w:bCs/>
+          <w:sz w:val="20"/>
+          <w:szCs w:val="20"/>
+        </w:rPr>
+        <w:t xml:space="preserve">2025–26 part mark: 65.3%</w:t>
+      </w:r>
+      <w:r>
+        <w:rPr>
+          <w:sz w:val="20"/>
+          <w:szCs w:val="20"/>
+        </w:rPr>
+        <w:t xml:space="preserve"> (passed at first attempt), including </w:t>
+      </w:r>
+      <w:r>
+        <w:rPr>
+          <w:b/>
+          <w:bCs/>
+          <w:sz w:val="20"/>
+          <w:szCs w:val="20"/>
+        </w:rPr>
+        <w:t xml:space="preserve">70% in the Advanced Individual Project and 70% in CFD</w:t>
+      </w:r>
+      <w:r>
+        <w:rPr>
+          <w:sz w:val="20"/>
+          <w:szCs w:val="20"/>
+        </w:rPr>
+        <w:t xml:space="preserve">.</w:t>
       </w:r>
     </w:p>
     <w:p>
@@ -473,7 +506,7 @@
           <w:sz w:val="21"/>
           <w:szCs w:val="21"/>
         </w:rPr>
-        <w:t xml:space="preserve">Individual Project — Machine Learning for Boiling Heat Transfer</w:t>
+        <w:t xml:space="preserve">Advanced Individual Project — Machine Learning for Boiling Heat Transfer</w:t>
       </w:r>
       <w:r>
         <w:rPr>
@@ -481,7 +514,7 @@
           <w:sz w:val="19"/>
           <w:szCs w:val="19"/>
         </w:rPr>
-        <w:t xml:space="preserve">	2025 – present</w:t>
+        <w:t xml:space="preserve">	2025 – 26 · awarded 70%</w:t>
       </w:r>
     </w:p>
     <w:p>
@@ -637,7 +670,7 @@
           <w:sz w:val="19"/>
           <w:szCs w:val="19"/>
         </w:rPr>
-        <w:t xml:space="preserve">	2025 – 26</w:t>
+        <w:t xml:space="preserve">	2025 – 26 · module 70%</w:t>
       </w:r>
     </w:p>
     <w:p>
@@ -801,7 +834,7 @@
           <w:sz w:val="19"/>
           <w:szCs w:val="19"/>
         </w:rPr>
-        <w:t xml:space="preserve">	2025</w:t>
+        <w:t xml:space="preserve">	2025 · coursework 84%</w:t>
       </w:r>
     </w:p>
     <w:p>
@@ -1247,7 +1280,7 @@
         </w:rPr>
         <w:t xml:space="preserve">Gym and running (</w:t>
       </w:r>
-      <w:hyperlink w:history="1" r:id="rIdyj9wy6fw0oy7ylrt1k_zb">
+      <w:hyperlink w:history="1" r:id="rIdt2optwpxtes-1v2jdzugc">
         <w:r>
           <w:rPr>
             <w:color w:val="0563C1"/>
@@ -1321,7 +1354,7 @@
         </w:rPr>
         <w:t xml:space="preserve"> — Personal Tutor, Wolfson School, Loughborough University.  </w:t>
       </w:r>
-      <w:hyperlink w:history="1" r:id="rIdclh0xnxsnh8svsifigyhm">
+      <w:hyperlink w:history="1" r:id="rIdpy3mdkcxdt_vflgbwgg2z">
         <w:r>
           <w:rPr>
             <w:color w:val="0563C1"/>

</xml_diff>

<commit_message>
Fix year status: 2025-26 was fourth year, final year is 2026-27
Remove all 'final-year' labels; individual project now labelled as the
MEng advanced individual project (25WSD550).

Co-Authored-By: Claude Fable 5 <noreply@anthropic.com>
</commit_message>
<xml_diff>
--- a/assets/Raymond_Twum-Barima_CV.docx
+++ b/assets/Raymond_Twum-Barima_CV.docx
@@ -45,7 +45,7 @@
         </w:rPr>
         <w:t xml:space="preserve">London  ·  07747 712 872  ·  </w:t>
       </w:r>
-      <w:hyperlink w:history="1" r:id="rIdmz-63lvig50f1csufnukt">
+      <w:hyperlink w:history="1" r:id="rIdkjvqqv43rqkex6seb0cr0">
         <w:r>
           <w:rPr>
             <w:color w:val="0563C1"/>
@@ -64,7 +64,7 @@
         </w:rPr>
         <w:t xml:space="preserve">  ·  </w:t>
       </w:r>
-      <w:hyperlink w:history="1" r:id="rId0wlxavgpq4ueddmc6duas">
+      <w:hyperlink w:history="1" r:id="rIdlyrmdmuzkgapu9hpdcqcg">
         <w:r>
           <w:rPr>
             <w:color w:val="0563C1"/>
@@ -83,7 +83,7 @@
         </w:rPr>
         <w:t xml:space="preserve">  ·  </w:t>
       </w:r>
-      <w:hyperlink w:history="1" r:id="rIdu3kbak1kmrvqjrpx7dgh7">
+      <w:hyperlink w:history="1" r:id="rIdl7lu5azitao8jmwjpchxx">
         <w:r>
           <w:rPr>
             <w:color w:val="0563C1"/>
@@ -102,7 +102,7 @@
         </w:rPr>
         <w:t xml:space="preserve">  ·  </w:t>
       </w:r>
-      <w:hyperlink w:history="1" r:id="rIdgxha2j82onaaymcrdirm1">
+      <w:hyperlink w:history="1" r:id="rIdqciui0salcxiz1j4kgcks">
         <w:r>
           <w:rPr>
             <w:color w:val="0563C1"/>
@@ -141,7 +141,7 @@
           <w:sz w:val="20"/>
           <w:szCs w:val="20"/>
         </w:rPr>
-        <w:t xml:space="preserve">Final-year MEng Mechanical Engineering student at Loughborough University with a year of industrial experience at the UK Atomic Energy Authority, where I carried out structural and thermal finite-element analysis of cryogenic fusion components in ANSYS Workbench. Strong in computational and thermofluids engineering — FEA, CFD and numerical methods — with applied machine-learning experience from a final-year project predicting boiling heat flux from infrared thermography. Rigorous about verification and validation, and an experienced team leader and communicator.</w:t>
+        <w:t xml:space="preserve">MEng Mechanical Engineering student at Loughborough University (final year 2026–27) with a year of industrial experience at the UK Atomic Energy Authority, where I carried out structural and thermal finite-element analysis of cryogenic fusion components in ANSYS Workbench. Strong in computational and thermofluids engineering — FEA, CFD and numerical methods — with applied machine-learning experience from an individual research project predicting boiling heat flux from infrared thermography (awarded 70%). Rigorous about verification and validation, and an experienced team leader and communicator.</w:t>
       </w:r>
     </w:p>
     <w:p>
@@ -1280,7 +1280,7 @@
         </w:rPr>
         <w:t xml:space="preserve">Gym and running (</w:t>
       </w:r>
-      <w:hyperlink w:history="1" r:id="rIdt2optwpxtes-1v2jdzugc">
+      <w:hyperlink w:history="1" r:id="rIdburtoli71mpotudconjmi">
         <w:r>
           <w:rPr>
             <w:color w:val="0563C1"/>
@@ -1354,7 +1354,7 @@
         </w:rPr>
         <w:t xml:space="preserve"> — Personal Tutor, Wolfson School, Loughborough University.  </w:t>
       </w:r>
-      <w:hyperlink w:history="1" r:id="rIdpy3mdkcxdt_vflgbwgg2z">
+      <w:hyperlink w:history="1" r:id="rIdcvjeno7dsptcdlsa92hx4">
         <w:r>
           <w:rPr>
             <w:color w:val="0563C1"/>

</xml_diff>